<commit_message>
Ritualistics: the Trap of the book all safety runes, kindling of a core behind the spire research, the scrollbar drawn from its own art
Co-Authored-By: Claude Opus 5.5 <noreply@anthropic.com>
Claude-Session: https://claude.ai/code/session_01YCWNLtj9zFsogxZeNiDKcG
</commit_message>
<xml_diff>
--- a/docs/Арлия_о_ритуалах.docx
+++ b/docs/Арлия_о_ритуалах.docx
@@ -255,7 +255,7 @@
           </w:tcPr>
           <w:p>
             <w:r>
-              <w:t>A cage made of caution. Nothing in it does anything - and that is exactly the point.</w:t>
+              <w:t>An old experiment of mine. Amusing - but not for a ritualist.</w:t>
             </w:r>
           </w:p>
         </w:tc>
@@ -855,7 +855,7 @@
           </w:tcPr>
           <w:p>
             <w:r>
-              <w:t>Wakes a dead core, the plain way. You could do better - if you dare to write your own.</w:t>
+              <w:t>Spire business. Learn how they are raised first - then come back and wake its heart.</w:t>
             </w:r>
           </w:p>
         </w:tc>

</xml_diff>